<commit_message>
Fix README: add architecture diagram, remove non-existent docs reference, fix formatting
</commit_message>
<xml_diff>
--- a/FINAL_PROJECT_REPORT.docx
+++ b/FINAL_PROJECT_REPORT.docx
@@ -365,14 +365,7 @@
           <w:color w:val="000000" w:themeColor="text1"/>
         </w:rPr>
         <w:br/>
-        <w:t>The K-Means clustering algorithm (K=20, selected via Elbow Method) was applied to geographic coordinates d</w:t>
-      </w:r>
-      <w:r>
-        <w:rPr>
-          <w:rFonts w:cs="Times New Roman"/>
-          <w:color w:val="000000" w:themeColor="text1"/>
-        </w:rPr>
-        <w:t xml:space="preserve">erived from taxi zone centroids. Using Dask's out-of-core processing, the model was trained on the entire 81.2 million row dataset without sampling. Model evaluation metrics </w:t>
+        <w:t xml:space="preserve">The K-Means clustering algorithm (K=20, selected via Elbow Method) was applied to geographic coordinates derived from taxi zone centroids. Using Dask's out-of-core processing, the model was trained on the entire 81.2 million row dataset without sampling. Model evaluation metrics </w:t>
       </w:r>
       <w:r>
         <w:rPr>
@@ -401,14 +394,7 @@
           <w:color w:val="000000" w:themeColor="text1"/>
         </w:rPr>
         <w:br/>
-        <w:t xml:space="preserve">Benchmarking demonstrated Spark's critical scalability advantage: scikit-learn crashed at 10 million rows due to memory constraints, while Spark successfully </w:t>
-      </w:r>
-      <w:r>
-        <w:rPr>
-          <w:rFonts w:cs="Times New Roman"/>
-          <w:color w:val="000000" w:themeColor="text1"/>
-        </w:rPr>
-        <w:t>processed 29.4 million rows in 8 minutes and Dask processed the full 84.6 million rows using lazy evaluation. A Lambda Architecture combining batch analytics with Apache Kafka streaming enables sub-5-second real-time predictions for incoming trip data.</w:t>
+        <w:t>Benchmarking demonstrated Spark's critical scalability advantage: scikit-learn crashed at 10 million rows due to memory constraints, while Spark successfully processed 29.4 million rows in 8 minutes and Dask processed the full 84.6 million rows using lazy evaluation. A Lambda Architecture combining batch analytics with Apache Kafka streaming enables sub-5-second real-time predictions for incoming trip data.</w:t>
       </w:r>
       <w:r>
         <w:rPr>
@@ -564,14 +550,7 @@
           <w:color w:val="000000" w:themeColor="text1"/>
         </w:rPr>
         <w:br/>
-        <w:t>The computational challenge is significant: processing 84</w:t>
-      </w:r>
-      <w:r>
-        <w:rPr>
-          <w:rFonts w:cs="Times New Roman"/>
-          <w:color w:val="000000" w:themeColor="text1"/>
-        </w:rPr>
-        <w:t>+ million records with traditional tools like pandas or Excel is impractical due to memory constraints (pandas requires data to fit in RAM). A single year of NYC taxi data exceeds 8 GB uncompressed, necessitating distributed computing frameworks like Apache Spark or out-of-core processing with Dask (Rocklin, 2015).</w:t>
+        <w:t>The computational challenge is significant: processing 84+ million records with traditional tools like pandas or Excel is impractical due to memory constraints (pandas requires data to fit in RAM). A single year of NYC taxi data exceeds 8 GB uncompressed, necessitating distributed computing frameworks like Apache Spark or out-of-core processing with Dask (Rocklin, 2015).</w:t>
       </w:r>
     </w:p>
     <w:p>
@@ -615,34 +594,21 @@
           <w:rFonts w:cs="Times New Roman"/>
           <w:color w:val="000000" w:themeColor="text1"/>
         </w:rPr>
-        <w:t xml:space="preserve">Primary Research Question: </w:t>
-      </w:r>
-      <w:r>
-        <w:rPr>
-          <w:rFonts w:cs="Times New Roman"/>
-          <w:color w:val="000000" w:themeColor="text1"/>
-        </w:rPr>
-        <w:t>Where and when should NYC taxi drivers position themselves to maximize trip volume and fare revenue?</w:t>
-      </w:r>
-      <w:r>
-        <w:rPr>
-          <w:rFonts w:cs="Times New Roman"/>
-          <w:color w:val="000000" w:themeColor="text1"/>
-        </w:rPr>
-        <w:br/>
-      </w:r>
-      <w:r>
-        <w:rPr>
-          <w:rFonts w:cs="Times New Roman"/>
-          <w:color w:val="000000" w:themeColor="text1"/>
-        </w:rPr>
-        <w:br/>
-      </w:r>
-      <w:r>
-        <w:rPr>
-          <w:rFonts w:cs="Times New Roman"/>
-          <w:color w:val="000000" w:themeColor="text1"/>
-        </w:rPr>
+        <w:t>Primary Research Question: Where and when should NYC taxi drivers position themselves to maximize trip volume and fare revenue?</w:t>
+      </w:r>
+      <w:r>
+        <w:rPr>
+          <w:rFonts w:cs="Times New Roman"/>
+          <w:color w:val="000000" w:themeColor="text1"/>
+        </w:rPr>
+        <w:br/>
+      </w:r>
+      <w:r>
+        <w:rPr>
+          <w:rFonts w:cs="Times New Roman"/>
+          <w:color w:val="000000" w:themeColor="text1"/>
+        </w:rPr>
+        <w:br/>
         <w:t>Sub-questions:</w:t>
       </w:r>
       <w:r>
@@ -651,12 +617,6 @@
           <w:color w:val="000000" w:themeColor="text1"/>
         </w:rPr>
         <w:br/>
-      </w:r>
-      <w:r>
-        <w:rPr>
-          <w:rFonts w:cs="Times New Roman"/>
-          <w:color w:val="000000" w:themeColor="text1"/>
-        </w:rPr>
         <w:t>1. Can we identify natural geographic clusters (hotspots) from 84.6 million trip pickup locations?</w:t>
       </w:r>
       <w:r>
@@ -696,27 +656,7 @@
           <w:color w:val="000000" w:themeColor="text1"/>
         </w:rPr>
         <w:br/>
-      </w:r>
-      <w:r>
-        <w:rPr>
-          <w:rFonts w:cs="Times New Roman"/>
-          <w:color w:val="000000" w:themeColor="text1"/>
-        </w:rPr>
-        <w:t xml:space="preserve">Problem Formulation: </w:t>
-      </w:r>
-      <w:r>
-        <w:rPr>
-          <w:rFonts w:cs="Times New Roman"/>
-          <w:color w:val="000000" w:themeColor="text1"/>
-        </w:rPr>
-        <w:t>This is framed as an unsupervised learning task—specifically</w:t>
-      </w:r>
-      <w:r>
-        <w:rPr>
-          <w:rFonts w:cs="Times New Roman"/>
-          <w:color w:val="000000" w:themeColor="text1"/>
-        </w:rPr>
-        <w:t>, geographic clustering using the K-Means algorithm (Lloyd, 1982). The objective function minimizes Within-Cluster Sum of Squared Errors (WSSSE):</w:t>
+        <w:t>Problem Formulation: This is framed as an unsupervised learning task—specifically, geographic clustering using the K-Means algorithm (Lloyd, 1982). The objective function minimizes Within-Cluster Sum of Squared Errors (WSSSE):</w:t>
       </w:r>
       <w:r>
         <w:rPr>
@@ -738,21 +678,7 @@
           <w:color w:val="000000" w:themeColor="text1"/>
         </w:rPr>
         <w:lastRenderedPageBreak/>
-        <w:t xml:space="preserve">    WSSSE = Σ</w:t>
-      </w:r>
-      <w:r>
-        <w:rPr>
-          <w:rFonts w:cs="Times New Roman"/>
-          <w:color w:val="000000" w:themeColor="text1"/>
-        </w:rPr>
-        <w:t>ᵢ</w:t>
-      </w:r>
-      <w:r>
-        <w:rPr>
-          <w:rFonts w:cs="Times New Roman"/>
-          <w:color w:val="000000" w:themeColor="text1"/>
-        </w:rPr>
-        <w:t xml:space="preserve"> Σₓ</w:t>
+        <w:t xml:space="preserve">    WSSSE = Σᵢ Σₓ</w:t>
       </w:r>
       <w:r>
         <w:rPr>
@@ -766,78 +692,22 @@
           <w:rFonts w:cs="Times New Roman"/>
           <w:color w:val="000000" w:themeColor="text1"/>
         </w:rPr>
-        <w:t>C</w:t>
-      </w:r>
-      <w:r>
-        <w:rPr>
-          <w:rFonts w:cs="Times New Roman"/>
-          <w:color w:val="000000" w:themeColor="text1"/>
-        </w:rPr>
-        <w:t>ᵢ</w:t>
-      </w:r>
-      <w:r>
-        <w:rPr>
-          <w:rFonts w:cs="Times New Roman"/>
-          <w:color w:val="000000" w:themeColor="text1"/>
-        </w:rPr>
-        <w:t xml:space="preserve"> ||x - μ</w:t>
-      </w:r>
-      <w:r>
-        <w:rPr>
-          <w:rFonts w:cs="Times New Roman"/>
-          <w:color w:val="000000" w:themeColor="text1"/>
-        </w:rPr>
-        <w:t>ᵢ</w:t>
-      </w:r>
-      <w:r>
-        <w:rPr>
-          <w:rFonts w:cs="Times New Roman"/>
-          <w:color w:val="000000" w:themeColor="text1"/>
-        </w:rPr>
-        <w:t>||²</w:t>
-      </w:r>
-      <w:r>
-        <w:rPr>
-          <w:rFonts w:cs="Times New Roman"/>
-          <w:color w:val="000000" w:themeColor="text1"/>
-        </w:rPr>
-        <w:br/>
-      </w:r>
-      <w:r>
-        <w:rPr>
-          <w:rFonts w:cs="Times New Roman"/>
-          <w:color w:val="000000" w:themeColor="text1"/>
-        </w:rPr>
-        <w:br/>
-        <w:t>Where x represents geographic coordinates (latitude, longitude), C</w:t>
-      </w:r>
-      <w:r>
-        <w:rPr>
-          <w:rFonts w:cs="Times New Roman"/>
-          <w:color w:val="000000" w:themeColor="text1"/>
-        </w:rPr>
-        <w:t>ᵢ</w:t>
-      </w:r>
-      <w:r>
-        <w:rPr>
-          <w:rFonts w:cs="Times New Roman"/>
-          <w:color w:val="000000" w:themeColor="text1"/>
-        </w:rPr>
-        <w:t xml:space="preserve"> is cluster i, and μ</w:t>
-      </w:r>
-      <w:r>
-        <w:rPr>
-          <w:rFonts w:cs="Times New Roman"/>
-          <w:color w:val="000000" w:themeColor="text1"/>
-        </w:rPr>
-        <w:t>ᵢ</w:t>
-      </w:r>
-      <w:r>
-        <w:rPr>
-          <w:rFonts w:cs="Times New Roman"/>
-          <w:color w:val="000000" w:themeColor="text1"/>
-        </w:rPr>
-        <w:t xml:space="preserve"> is the cluster centroid. The optimal number of clusters K is determined using the Elbow Method.</w:t>
+        <w:t>Cᵢ ||x - μᵢ||²</w:t>
+      </w:r>
+      <w:r>
+        <w:rPr>
+          <w:rFonts w:cs="Times New Roman"/>
+          <w:color w:val="000000" w:themeColor="text1"/>
+        </w:rPr>
+        <w:br/>
+      </w:r>
+      <w:r>
+        <w:rPr>
+          <w:rFonts w:cs="Times New Roman"/>
+          <w:color w:val="000000" w:themeColor="text1"/>
+        </w:rPr>
+        <w:br/>
+        <w:t>Where x represents geographic coordinates (latitude, longitude), Cᵢ is cluster i, and μᵢ is the cluster centroid. The optimal number of clusters K is determined using the Elbow Method.</w:t>
       </w:r>
     </w:p>
     <w:p>
@@ -1783,12 +1653,6 @@
           <w:color w:val="000000" w:themeColor="text1"/>
         </w:rPr>
         <w:br/>
-      </w:r>
-      <w:r>
-        <w:rPr>
-          <w:rFonts w:cs="Times New Roman"/>
-          <w:color w:val="000000" w:themeColor="text1"/>
-        </w:rPr>
         <w:t>Ferreira et al. (2013) developed visual analytics techniques for exploring NYC taxi trips using spatiotemporal aggregation and interactive dashboards. Their work processed taxi data to identify temporal patterns in demand across NYC boroughs. However, their approach focused primarily on visualization without incorporating machine learning for automated pattern discovery. Our work extends this by applying K-Means clustering for unsupervised hotspot identification and adding real-time streaming capabilities.</w:t>
       </w:r>
       <w:r>
@@ -1804,12 +1668,6 @@
           <w:color w:val="000000" w:themeColor="text1"/>
         </w:rPr>
         <w:br/>
-      </w:r>
-      <w:r>
-        <w:rPr>
-          <w:rFonts w:cs="Times New Roman"/>
-          <w:color w:val="000000" w:themeColor="text1"/>
-        </w:rPr>
         <w:t>Study 2: Taxi Demand Prediction with Streaming Data</w:t>
       </w:r>
       <w:r>
@@ -1818,40 +1676,21 @@
           <w:color w:val="000000" w:themeColor="text1"/>
         </w:rPr>
         <w:br/>
-      </w:r>
-      <w:r>
-        <w:rPr>
-          <w:rFonts w:cs="Times New Roman"/>
-          <w:color w:val="000000" w:themeColor="text1"/>
-        </w:rPr>
-        <w:t>Moreira-Matias et al. (2013) developed short-term taxi demand prediction models using time series analysis on streaming data, achieving approximately 85% accuracy for 30-minute forecasting windows. Their implementation was limited to single-machine processing and could not scale to datasets exceeding available RAM. Our project addresses this limitation by implementing a Lambda Architecture that combines batch processing (Spark/Dask) with stream processing</w:t>
-      </w:r>
-      <w:r>
-        <w:rPr>
-          <w:rFonts w:cs="Times New Roman"/>
-          <w:color w:val="000000" w:themeColor="text1"/>
-        </w:rPr>
-        <w:t xml:space="preserve"> (Kafka + Spark Streaming).</w:t>
-      </w:r>
-      <w:r>
-        <w:rPr>
-          <w:rFonts w:cs="Times New Roman"/>
-          <w:color w:val="000000" w:themeColor="text1"/>
-        </w:rPr>
-        <w:br/>
-      </w:r>
-      <w:r>
-        <w:rPr>
-          <w:rFonts w:cs="Times New Roman"/>
-          <w:color w:val="000000" w:themeColor="text1"/>
-        </w:rPr>
-        <w:br/>
-      </w:r>
-      <w:r>
-        <w:rPr>
-          <w:rFonts w:cs="Times New Roman"/>
-          <w:color w:val="000000" w:themeColor="text1"/>
-        </w:rPr>
+        <w:t>Moreira-Matias et al. (2013) developed short-term taxi demand prediction models using time series analysis on streaming data, achieving approximately 85% accuracy for 30-minute forecasting windows. Their implementation was limited to single-machine processing and could not scale to datasets exceeding available RAM. Our project addresses this limitation by implementing a Lambda Architecture that combines batch processing (Spark/Dask) with stream processing (Kafka + Spark Streaming).</w:t>
+      </w:r>
+      <w:r>
+        <w:rPr>
+          <w:rFonts w:cs="Times New Roman"/>
+          <w:color w:val="000000" w:themeColor="text1"/>
+        </w:rPr>
+        <w:br/>
+      </w:r>
+      <w:r>
+        <w:rPr>
+          <w:rFonts w:cs="Times New Roman"/>
+          <w:color w:val="000000" w:themeColor="text1"/>
+        </w:rPr>
+        <w:br/>
         <w:t>Study 3: Apache Spark for Big Data Processing</w:t>
       </w:r>
       <w:r>
@@ -1860,12 +1699,6 @@
           <w:color w:val="000000" w:themeColor="text1"/>
         </w:rPr>
         <w:br/>
-      </w:r>
-      <w:r>
-        <w:rPr>
-          <w:rFonts w:cs="Times New Roman"/>
-          <w:color w:val="000000" w:themeColor="text1"/>
-        </w:rPr>
         <w:t>Zaharia et al. (2016) introduced Apache Spark as a unified engine for large-scale data processing, demonstrating 10-100x performance improvements over Hadoop MapReduce for iterative machine learning algorithms. Their work established the theoretical foundation for our choice of Spark MLlib for K-Means clustering on taxi coordinate data.</w:t>
       </w:r>
       <w:r>
@@ -2715,14 +2548,7 @@
           <w:color w:val="000000" w:themeColor="text1"/>
         </w:rPr>
         <w:br/>
-        <w:t xml:space="preserve">Data Collection Method: </w:t>
-      </w:r>
-      <w:r>
-        <w:rPr>
-          <w:rFonts w:cs="Times New Roman"/>
-          <w:color w:val="000000" w:themeColor="text1"/>
-        </w:rPr>
-        <w:t>Automated Python scripts using the requests library with ThreadPoolExecutor for parallel downloads. 12 monthly Parquet files for 2019 were retrieved from the NYC TLC CloudFront distribution.</w:t>
+        <w:t>Data Collection Method: Automated Python scripts using the requests library with ThreadPoolExecutor for parallel downloads. 12 monthly Parquet files for 2019 were retrieved from the NYC TLC CloudFront distribution.</w:t>
       </w:r>
       <w:r>
         <w:rPr>
@@ -4098,77 +3924,37 @@
           <w:rFonts w:cs="Times New Roman"/>
           <w:color w:val="000000" w:themeColor="text1"/>
         </w:rPr>
-        <w:t xml:space="preserve">License: </w:t>
-      </w:r>
-      <w:r>
-        <w:rPr>
-          <w:rFonts w:cs="Times New Roman"/>
-          <w:color w:val="000000" w:themeColor="text1"/>
-        </w:rPr>
-        <w:t>NYC Open Data Terms of Use (Public Domain). The data is freely available for commercial and non-commercial use without attribution requirements.</w:t>
-      </w:r>
-      <w:r>
-        <w:rPr>
-          <w:rFonts w:cs="Times New Roman"/>
-          <w:color w:val="000000" w:themeColor="text1"/>
-        </w:rPr>
-        <w:br/>
-      </w:r>
-      <w:r>
-        <w:rPr>
-          <w:rFonts w:cs="Times New Roman"/>
-          <w:color w:val="000000" w:themeColor="text1"/>
-        </w:rPr>
-        <w:br/>
-      </w:r>
-      <w:r>
-        <w:rPr>
-          <w:rFonts w:cs="Times New Roman"/>
-          <w:color w:val="000000" w:themeColor="text1"/>
-        </w:rPr>
-        <w:t xml:space="preserve">Privacy Protections: </w:t>
-      </w:r>
-      <w:r>
-        <w:rPr>
-          <w:rFonts w:cs="Times New Roman"/>
-          <w:color w:val="000000" w:themeColor="text1"/>
-        </w:rPr>
-        <w:t>The 2019+ dataset uses aggregated Taxi Zone IDs (265 zones) instead of raw GPS coordinates, preventing individual trip tracking. No personally identifiable information (driver names, medallion numbers, passenger details) is included in the public dataset.</w:t>
-      </w:r>
-      <w:r>
-        <w:rPr>
-          <w:rFonts w:cs="Times New Roman"/>
-          <w:color w:val="000000" w:themeColor="text1"/>
-        </w:rPr>
-        <w:br/>
-      </w:r>
-      <w:r>
-        <w:rPr>
-          <w:rFonts w:cs="Times New Roman"/>
-          <w:color w:val="000000" w:themeColor="text1"/>
-        </w:rPr>
-        <w:br/>
-      </w:r>
-      <w:r>
-        <w:rPr>
-          <w:rFonts w:cs="Times New Roman"/>
-          <w:color w:val="000000" w:themeColor="text1"/>
-        </w:rPr>
-        <w:t xml:space="preserve">Ethical Considerations: </w:t>
-      </w:r>
-      <w:r>
-        <w:rPr>
-          <w:rFonts w:cs="Times New Roman"/>
-          <w:color w:val="000000" w:themeColor="text1"/>
-        </w:rPr>
-        <w:t>Analysis results may reflect socioeconomic disparities in taxi s</w:t>
-      </w:r>
-      <w:r>
-        <w:rPr>
-          <w:rFonts w:cs="Times New Roman"/>
-          <w:color w:val="000000" w:themeColor="text1"/>
-        </w:rPr>
-        <w:t>ervice availability across neighborhoods. Our findings are intended for operational optimization and do not enable discrimination based on protected characteristics</w:t>
+        <w:t>License: NYC Open Data Terms of Use (Public Domain). The data is freely available for commercial and non-commercial use without attribution requirements.</w:t>
+      </w:r>
+      <w:r>
+        <w:rPr>
+          <w:rFonts w:cs="Times New Roman"/>
+          <w:color w:val="000000" w:themeColor="text1"/>
+        </w:rPr>
+        <w:br/>
+      </w:r>
+      <w:r>
+        <w:rPr>
+          <w:rFonts w:cs="Times New Roman"/>
+          <w:color w:val="000000" w:themeColor="text1"/>
+        </w:rPr>
+        <w:br/>
+        <w:t>Privacy Protections: The 2019+ dataset uses aggregated Taxi Zone IDs (265 zones) instead of raw GPS coordinates, preventing individual trip tracking. No personally identifiable information (driver names, medallion numbers, passenger details) is included in the public dataset.</w:t>
+      </w:r>
+      <w:r>
+        <w:rPr>
+          <w:rFonts w:cs="Times New Roman"/>
+          <w:color w:val="000000" w:themeColor="text1"/>
+        </w:rPr>
+        <w:br/>
+      </w:r>
+      <w:r>
+        <w:rPr>
+          <w:rFonts w:cs="Times New Roman"/>
+          <w:color w:val="000000" w:themeColor="text1"/>
+        </w:rPr>
+        <w:br/>
+        <w:t>Ethical Considerations: Analysis results may reflect socioeconomic disparities in taxi service availability across neighborhoods. Our findings are intended for operational optimization and do not enable discrimination based on protected characteristics</w:t>
       </w:r>
       <w:r>
         <w:rPr>
@@ -4248,12 +4034,6 @@
           <w:color w:val="000000" w:themeColor="text1"/>
         </w:rPr>
         <w:br/>
-      </w:r>
-      <w:r>
-        <w:rPr>
-          <w:rFonts w:cs="Times New Roman"/>
-          <w:color w:val="000000" w:themeColor="text1"/>
-        </w:rPr>
         <w:t>The system implements a Lambda Architecture (Marz &amp; Warren, 2015) with three layers:</w:t>
       </w:r>
       <w:r>
@@ -4330,14 +4110,7 @@
           <w:color w:val="000000" w:themeColor="text1"/>
         </w:rPr>
         <w:br/>
-        <w:t xml:space="preserve">   Pre-trained K-Means model serves both batch </w:t>
-      </w:r>
-      <w:r>
-        <w:rPr>
-          <w:rFonts w:cs="Times New Roman"/>
-          <w:color w:val="000000" w:themeColor="text1"/>
-        </w:rPr>
-        <w:t>analytics and streaming predictions, ensuring    consistency between historical analysis and real-time inference.</w:t>
+        <w:t xml:space="preserve">   Pre-trained K-Means model serves both batch analytics and streaming predictions, ensuring    consistency between historical analysis and real-time inference.</w:t>
       </w:r>
       <w:r>
         <w:rPr>
@@ -4445,12 +4218,6 @@
           <w:color w:val="000000" w:themeColor="text1"/>
         </w:rPr>
         <w:br/>
-      </w:r>
-      <w:r>
-        <w:rPr>
-          <w:rFonts w:cs="Times New Roman"/>
-          <w:color w:val="000000" w:themeColor="text1"/>
-        </w:rPr>
         <w:t>• Source: NYC TLC CloudFront CDN (https://d37ci6vzurychx.cloudfront.net/trip-data/)</w:t>
       </w:r>
       <w:r>
@@ -4490,12 +4257,6 @@
           <w:color w:val="000000" w:themeColor="text1"/>
         </w:rPr>
         <w:br/>
-      </w:r>
-      <w:r>
-        <w:rPr>
-          <w:rFonts w:cs="Times New Roman"/>
-          <w:color w:val="000000" w:themeColor="text1"/>
-        </w:rPr>
         <w:t>Storage Format Selection:</w:t>
       </w:r>
       <w:r>
@@ -4504,12 +4265,6 @@
           <w:color w:val="000000" w:themeColor="text1"/>
         </w:rPr>
         <w:br/>
-      </w:r>
-      <w:r>
-        <w:rPr>
-          <w:rFonts w:cs="Times New Roman"/>
-          <w:color w:val="000000" w:themeColor="text1"/>
-        </w:rPr>
         <w:t>Apache Parquet was selected over CSV/JSON for the following technical reasons:</w:t>
       </w:r>
       <w:r>
@@ -4526,14 +4281,7 @@
           <w:color w:val="000000" w:themeColor="text1"/>
         </w:rPr>
         <w:br/>
-        <w:t xml:space="preserve">• Snappy compression: 10x size reduction vs </w:t>
-      </w:r>
-      <w:r>
-        <w:rPr>
-          <w:rFonts w:cs="Times New Roman"/>
-          <w:color w:val="000000" w:themeColor="text1"/>
-        </w:rPr>
-        <w:t>uncompressed CSV</w:t>
+        <w:t>• Snappy compression: 10x size reduction vs uncompressed CSV</w:t>
       </w:r>
       <w:r>
         <w:rPr>
@@ -4617,12 +4365,6 @@
           <w:color w:val="000000" w:themeColor="text1"/>
         </w:rPr>
         <w:br/>
-      </w:r>
-      <w:r>
-        <w:rPr>
-          <w:rFonts w:cs="Times New Roman"/>
-          <w:color w:val="000000" w:themeColor="text1"/>
-        </w:rPr>
         <w:t>The data cleaning pipeline was implemented using PySpark DataFrames with the following stages:</w:t>
       </w:r>
       <w:r>
@@ -4733,14 +4475,7 @@
           <w:color w:val="000000" w:themeColor="text1"/>
         </w:rPr>
         <w:br/>
-        <w:t>Removed ~95,000 rows with negat</w:t>
-      </w:r>
-      <w:r>
-        <w:rPr>
-          <w:rFonts w:cs="Times New Roman"/>
-          <w:color w:val="000000" w:themeColor="text1"/>
-        </w:rPr>
-        <w:t>ive fares, distances, or invalid timestamps.</w:t>
+        <w:t>Removed ~95,000 rows with negative fares, distances, or invalid timestamps.</w:t>
       </w:r>
       <w:r>
         <w:rPr>
@@ -4842,34 +4577,21 @@
           <w:color w:val="000000" w:themeColor="text1"/>
         </w:rPr>
         <w:br/>
-        <w:t>Critical fix: Initial implementation used subset=['tpep_pickup_datetime'] which incorrectly flagged different trips with t</w:t>
-      </w:r>
-      <w:r>
-        <w:rPr>
-          <w:rFonts w:cs="Times New Roman"/>
-          <w:color w:val="000000" w:themeColor="text1"/>
-        </w:rPr>
-        <w:t>he same timestamp as duplicates, causing 69% data loss. Switching to full-row deduplication improved retention from 31% to 99.15%.</w:t>
-      </w:r>
-      <w:r>
-        <w:rPr>
-          <w:rFonts w:cs="Times New Roman"/>
-          <w:color w:val="000000" w:themeColor="text1"/>
-        </w:rPr>
-        <w:br/>
-      </w:r>
-      <w:r>
-        <w:rPr>
-          <w:rFonts w:cs="Times New Roman"/>
-          <w:color w:val="000000" w:themeColor="text1"/>
-        </w:rPr>
-        <w:br/>
-      </w:r>
-      <w:r>
-        <w:rPr>
-          <w:rFonts w:cs="Times New Roman"/>
-          <w:color w:val="000000" w:themeColor="text1"/>
-        </w:rPr>
+        <w:t>Critical fix: Initial implementation used subset=['tpep_pickup_datetime'] which incorrectly flagged different trips with the same timestamp as duplicates, causing 69% data loss. Switching to full-row deduplication improved retention from 31% to 99.15%.</w:t>
+      </w:r>
+      <w:r>
+        <w:rPr>
+          <w:rFonts w:cs="Times New Roman"/>
+          <w:color w:val="000000" w:themeColor="text1"/>
+        </w:rPr>
+        <w:br/>
+      </w:r>
+      <w:r>
+        <w:rPr>
+          <w:rFonts w:cs="Times New Roman"/>
+          <w:color w:val="000000" w:themeColor="text1"/>
+        </w:rPr>
+        <w:br/>
         <w:t>Cleaning Results Summary:</w:t>
       </w:r>
       <w:r>
@@ -5151,12 +4873,6 @@
           <w:color w:val="000000" w:themeColor="text1"/>
         </w:rPr>
         <w:br/>
-      </w:r>
-      <w:r>
-        <w:rPr>
-          <w:rFonts w:cs="Times New Roman"/>
-          <w:color w:val="000000" w:themeColor="text1"/>
-        </w:rPr>
         <w:t>```python</w:t>
       </w:r>
       <w:r>
@@ -5228,12 +4944,6 @@
           <w:color w:val="000000" w:themeColor="text1"/>
         </w:rPr>
         <w:br/>
-      </w:r>
-      <w:r>
-        <w:rPr>
-          <w:rFonts w:cs="Times New Roman"/>
-          <w:color w:val="000000" w:themeColor="text1"/>
-        </w:rPr>
         <w:t>Spatial Features (Critical for K-Means):</w:t>
       </w:r>
       <w:r>
@@ -5242,12 +4952,6 @@
           <w:color w:val="000000" w:themeColor="text1"/>
         </w:rPr>
         <w:br/>
-      </w:r>
-      <w:r>
-        <w:rPr>
-          <w:rFonts w:cs="Times New Roman"/>
-          <w:color w:val="000000" w:themeColor="text1"/>
-        </w:rPr>
         <w:t>The 2019+ NYC TLC data uses Taxi Zone IDs (1-265) instead of raw GPS coordinates. For K-Means clustering on geographic data, we must convert LocationIDs to coordinates:</w:t>
       </w:r>
       <w:r>
@@ -5333,14 +5037,7 @@
           <w:color w:val="000000" w:themeColor="text1"/>
         </w:rPr>
         <w:br/>
-        <w:t>assembler = VectorAss</w:t>
-      </w:r>
-      <w:r>
-        <w:rPr>
-          <w:rFonts w:cs="Times New Roman"/>
-          <w:color w:val="000000" w:themeColor="text1"/>
-        </w:rPr>
-        <w:t>embler(</w:t>
+        <w:t>assembler = VectorAssembler(</w:t>
       </w:r>
       <w:r>
         <w:rPr>
@@ -5440,12 +5137,6 @@
           <w:color w:val="000000" w:themeColor="text1"/>
         </w:rPr>
         <w:br/>
-      </w:r>
-      <w:r>
-        <w:rPr>
-          <w:rFonts w:cs="Times New Roman"/>
-          <w:color w:val="000000" w:themeColor="text1"/>
-        </w:rPr>
         <w:t>K-Means clustering (Lloyd, 1982) was selected for the following reasons:</w:t>
       </w:r>
       <w:r>
@@ -5493,12 +5184,6 @@
           <w:color w:val="000000" w:themeColor="text1"/>
         </w:rPr>
         <w:br/>
-      </w:r>
-      <w:r>
-        <w:rPr>
-          <w:rFonts w:cs="Times New Roman"/>
-          <w:color w:val="000000" w:themeColor="text1"/>
-        </w:rPr>
         <w:t>Hyperparameter Selection (Elbow Method):</w:t>
       </w:r>
       <w:r>
@@ -5507,20 +5192,7 @@
           <w:color w:val="000000" w:themeColor="text1"/>
         </w:rPr>
         <w:br/>
-      </w:r>
-      <w:r>
-        <w:rPr>
-          <w:rFonts w:cs="Times New Roman"/>
-          <w:color w:val="000000" w:themeColor="text1"/>
-        </w:rPr>
-        <w:t>The optimal number of clusters K was determined using the Elbow Method, which plots WSSSE (Within-Set Sum of Square</w:t>
-      </w:r>
-      <w:r>
-        <w:rPr>
-          <w:rFonts w:cs="Times New Roman"/>
-          <w:color w:val="000000" w:themeColor="text1"/>
-        </w:rPr>
-        <w:t>d Errors) against K values:</w:t>
+        <w:t>The optimal number of clusters K was determined using the Elbow Method, which plots WSSSE (Within-Set Sum of Squared Errors) against K values:</w:t>
       </w:r>
       <w:r>
         <w:rPr>
@@ -6135,12 +5807,6 @@
           <w:color w:val="000000" w:themeColor="text1"/>
         </w:rPr>
         <w:br/>
-      </w:r>
-      <w:r>
-        <w:rPr>
-          <w:rFonts w:cs="Times New Roman"/>
-          <w:color w:val="000000" w:themeColor="text1"/>
-        </w:rPr>
         <w:t>Model Training Implementation:</w:t>
       </w:r>
       <w:r>
@@ -6149,12 +5815,6 @@
           <w:color w:val="000000" w:themeColor="text1"/>
         </w:rPr>
         <w:br/>
-      </w:r>
-      <w:r>
-        <w:rPr>
-          <w:rFonts w:cs="Times New Roman"/>
-          <w:color w:val="000000" w:themeColor="text1"/>
-        </w:rPr>
         <w:t>```python</w:t>
       </w:r>
       <w:r>
@@ -6163,12 +5823,6 @@
           <w:color w:val="000000" w:themeColor="text1"/>
         </w:rPr>
         <w:br/>
-      </w:r>
-      <w:r>
-        <w:rPr>
-          <w:rFonts w:cs="Times New Roman"/>
-          <w:color w:val="000000" w:themeColor="text1"/>
-        </w:rPr>
         <w:t xml:space="preserve">from </w:t>
       </w:r>
       <w:proofErr w:type="spellStart"/>
@@ -6624,12 +6278,6 @@
           <w:color w:val="000000" w:themeColor="text1"/>
         </w:rPr>
         <w:br/>
-      </w:r>
-      <w:r>
-        <w:rPr>
-          <w:rFonts w:cs="Times New Roman"/>
-          <w:color w:val="000000" w:themeColor="text1"/>
-        </w:rPr>
         <w:t>1. Inertia (Within-Set Sum of Squared Errors):</w:t>
       </w:r>
       <w:r>
@@ -6638,27 +6286,7 @@
           <w:color w:val="000000" w:themeColor="text1"/>
         </w:rPr>
         <w:br/>
-      </w:r>
-      <w:r>
-        <w:rPr>
-          <w:rFonts w:cs="Times New Roman"/>
-          <w:color w:val="000000" w:themeColor="text1"/>
-        </w:rPr>
-        <w:t xml:space="preserve">   WSSSE = Σ</w:t>
-      </w:r>
-      <w:r>
-        <w:rPr>
-          <w:rFonts w:cs="Times New Roman"/>
-          <w:color w:val="000000" w:themeColor="text1"/>
-        </w:rPr>
-        <w:t>ᵢ</w:t>
-      </w:r>
-      <w:r>
-        <w:rPr>
-          <w:rFonts w:cs="Times New Roman"/>
-          <w:color w:val="000000" w:themeColor="text1"/>
-        </w:rPr>
-        <w:t xml:space="preserve"> Σₓ</w:t>
+        <w:t xml:space="preserve">   WSSSE = Σᵢ Σₓ</w:t>
       </w:r>
       <w:r>
         <w:rPr>
@@ -6672,35 +6300,7 @@
           <w:rFonts w:cs="Times New Roman"/>
           <w:color w:val="000000" w:themeColor="text1"/>
         </w:rPr>
-        <w:t>C</w:t>
-      </w:r>
-      <w:r>
-        <w:rPr>
-          <w:rFonts w:cs="Times New Roman"/>
-          <w:color w:val="000000" w:themeColor="text1"/>
-        </w:rPr>
-        <w:t>ᵢ</w:t>
-      </w:r>
-      <w:r>
-        <w:rPr>
-          <w:rFonts w:cs="Times New Roman"/>
-          <w:color w:val="000000" w:themeColor="text1"/>
-        </w:rPr>
-        <w:t xml:space="preserve"> ||x - μ</w:t>
-      </w:r>
-      <w:r>
-        <w:rPr>
-          <w:rFonts w:cs="Times New Roman"/>
-          <w:color w:val="000000" w:themeColor="text1"/>
-        </w:rPr>
-        <w:t>ᵢ</w:t>
-      </w:r>
-      <w:r>
-        <w:rPr>
-          <w:rFonts w:cs="Times New Roman"/>
-          <w:color w:val="000000" w:themeColor="text1"/>
-        </w:rPr>
-        <w:t>||²</w:t>
+        <w:t>Cᵢ ||x - μᵢ||²</w:t>
       </w:r>
       <w:r>
         <w:rPr>
@@ -6747,12 +6347,6 @@
           <w:color w:val="000000" w:themeColor="text1"/>
         </w:rPr>
         <w:br/>
-      </w:r>
-      <w:r>
-        <w:rPr>
-          <w:rFonts w:cs="Times New Roman"/>
-          <w:color w:val="000000" w:themeColor="text1"/>
-        </w:rPr>
         <w:t>2. Silhouette Score:</w:t>
       </w:r>
       <w:r>
@@ -6761,12 +6355,6 @@
           <w:color w:val="000000" w:themeColor="text1"/>
         </w:rPr>
         <w:br/>
-      </w:r>
-      <w:r>
-        <w:rPr>
-          <w:rFonts w:cs="Times New Roman"/>
-          <w:color w:val="000000" w:themeColor="text1"/>
-        </w:rPr>
         <w:t xml:space="preserve">   s(i) = (b(i) - a(i)) / max(a(i), b(i))</w:t>
       </w:r>
       <w:r>
@@ -6806,12 +6394,6 @@
           <w:color w:val="000000" w:themeColor="text1"/>
         </w:rPr>
         <w:br/>
-      </w:r>
-      <w:r>
-        <w:rPr>
-          <w:rFonts w:cs="Times New Roman"/>
-          <w:color w:val="000000" w:themeColor="text1"/>
-        </w:rPr>
         <w:t>3. Train-Test Validation:</w:t>
       </w:r>
       <w:r>
@@ -6820,12 +6402,6 @@
           <w:color w:val="000000" w:themeColor="text1"/>
         </w:rPr>
         <w:br/>
-      </w:r>
-      <w:r>
-        <w:rPr>
-          <w:rFonts w:cs="Times New Roman"/>
-          <w:color w:val="000000" w:themeColor="text1"/>
-        </w:rPr>
         <w:t xml:space="preserve">   Total rows processed: 81,182,260 (100% of cleaned data)</w:t>
       </w:r>
       <w:r>
@@ -6834,14 +6410,7 @@
           <w:color w:val="000000" w:themeColor="text1"/>
         </w:rPr>
         <w:br/>
-        <w:t xml:space="preserve">   Training set: 6,4</w:t>
-      </w:r>
-      <w:r>
-        <w:rPr>
-          <w:rFonts w:cs="Times New Roman"/>
-          <w:color w:val="000000" w:themeColor="text1"/>
-        </w:rPr>
-        <w:t>94,580 rows (80% of validation sample)</w:t>
+        <w:t xml:space="preserve">   Training set: 6,494,580 rows (80% of validation sample)</w:t>
       </w:r>
       <w:r>
         <w:rPr>
@@ -9480,14 +9049,7 @@
           <w:color w:val="000000" w:themeColor="text1"/>
         </w:rPr>
         <w:br/>
-        <w:t xml:space="preserve">Key Finding: </w:t>
-      </w:r>
-      <w:r>
-        <w:rPr>
-          <w:rFonts w:cs="Times New Roman"/>
-          <w:color w:val="000000" w:themeColor="text1"/>
-        </w:rPr>
-        <w:t>Spark demonstrates 100x scalability advantage for datasets exceeding 10 million rows. scikit-learn's in-memory requirement causes OutOfMemoryError, while Spark's distributed processing handles the full dataset efficiently.</w:t>
+        <w:t>Key Finding: Spark demonstrates 100x scalability advantage for datasets exceeding 10 million rows. scikit-learn's in-memory requirement causes OutOfMemoryError, while Spark's distributed processing handles the full dataset efficiently.</w:t>
       </w:r>
     </w:p>
     <w:p>
@@ -10669,14 +10231,7 @@
         </w:rPr>
         <w:lastRenderedPageBreak/>
         <w:br/>
-        <w:t xml:space="preserve">Airport Premium Discovery: </w:t>
-      </w:r>
-      <w:r>
-        <w:rPr>
-          <w:rFonts w:cs="Times New Roman"/>
-          <w:color w:val="000000" w:themeColor="text1"/>
-        </w:rPr>
-        <w:t>JFK Airport (Cluster 1) and LaGuardia Airport (Cluster 2) demonstrate 3-4x higher average fares ($40.32 and $31.50 respectively) compared to the city average ($11.19). JFK generated 3.17 million trips while LaGuardia generated 2.15 million trips. This represents a significant revenue opportunity for drivers willing to wait for airport fares—earning premium rates despite moderate trip volumes.</w:t>
+        <w:t>Airport Premium Discovery: JFK Airport (Cluster 1) and LaGuardia Airport (Cluster 2) demonstrate 3-4x higher average fares ($40.32 and $31.50 respectively) compared to the city average ($11.19). JFK generated 3.17 million trips while LaGuardia generated 2.15 million trips. This represents a significant revenue opportunity for drivers willing to wait for airport fares—earning premium rates despite moderate trip volumes.</w:t>
       </w:r>
     </w:p>
     <w:p>
@@ -10801,14 +10356,7 @@
           <w:color w:val="000000" w:themeColor="text1"/>
         </w:rPr>
         <w:br/>
-        <w:t>The clustering results align with domain kn</w:t>
-      </w:r>
-      <w:r>
-        <w:rPr>
-          <w:rFonts w:cs="Times New Roman"/>
-          <w:color w:val="000000" w:themeColor="text1"/>
-        </w:rPr>
-        <w:t>owledge about NYC taxi patterns:</w:t>
+        <w:t>The clustering results align with domain knowledge about NYC taxi patterns:</w:t>
       </w:r>
       <w:r>
         <w:rPr>
@@ -11499,14 +11047,7 @@
           <w:rFonts w:cs="Times New Roman"/>
           <w:color w:val="000000" w:themeColor="text1"/>
         </w:rPr>
-        <w:t>This project successfully developed a scalable Big Data analytics pipeline for NYC taxi hotspot identification, processing 81.2 million trip records using Apache Spark and Dask. Using Dask's out-of-core processing with MiniBatch K-Means, we processed 100% of the dataset without sampling—a significant improvement over memory-constrained approaches. The K-Means clustering model (K=20) achieved excellent cluster separation (Silhouette Score: 0.7100) and identified actionable geographic hotspots for taxi driver</w:t>
-      </w:r>
-      <w:r>
-        <w:rPr>
-          <w:rFonts w:cs="Times New Roman"/>
-          <w:color w:val="000000" w:themeColor="text1"/>
-        </w:rPr>
-        <w:t xml:space="preserve"> positioning.</w:t>
+        <w:t>This project successfully developed a scalable Big Data analytics pipeline for NYC taxi hotspot identification, processing 81.2 million trip records using Apache Spark and Dask. Using Dask's out-of-core processing with MiniBatch K-Means, we processed 100% of the dataset without sampling—a significant improvement over memory-constrained approaches. The K-Means clustering model (K=20) achieved excellent cluster separation (Silhouette Score: 0.7100) and identified actionable geographic hotspots for taxi driver positioning.</w:t>
       </w:r>
       <w:r>
         <w:rPr>
@@ -11710,14 +11251,7 @@
           <w:color w:val="000000" w:themeColor="text1"/>
         </w:rPr>
         <w:br/>
-        <w:t xml:space="preserve">This work demonstrates the practical application of Big Data technologies for transportation optimization and provides a </w:t>
-      </w:r>
-      <w:r>
-        <w:rPr>
-          <w:rFonts w:cs="Times New Roman"/>
-          <w:color w:val="000000" w:themeColor="text1"/>
-        </w:rPr>
-        <w:t>foundation for production deployment in taxi dispatch systems.</w:t>
+        <w:t>This work demonstrates the practical application of Big Data technologies for transportation optimization and provides a foundation for production deployment in taxi dispatch systems.</w:t>
       </w:r>
     </w:p>
     <w:p>
@@ -12371,14 +11905,7 @@
                 <w:rFonts w:cs="Times New Roman"/>
                 <w:color w:val="000000" w:themeColor="text1"/>
               </w:rPr>
-              <w:t xml:space="preserve">10+ </w:t>
-            </w:r>
-            <w:r>
-              <w:rPr>
-                <w:rFonts w:cs="Times New Roman"/>
-                <w:color w:val="000000" w:themeColor="text1"/>
-              </w:rPr>
-              <w:t>figures</w:t>
+              <w:t>10+ figures</w:t>
             </w:r>
           </w:p>
         </w:tc>
@@ -12829,12 +12356,6 @@
                 <w:color w:val="000000" w:themeColor="text1"/>
               </w:rPr>
               <w:br/>
-            </w:r>
-            <w:r>
-              <w:rPr>
-                <w:rFonts w:cs="Times New Roman"/>
-                <w:color w:val="000000" w:themeColor="text1"/>
-              </w:rPr>
               <w:t>• Hotspot analysis &amp; insights</w:t>
             </w:r>
             <w:r>
@@ -13256,14 +12777,7 @@
           <w:color w:val="000000" w:themeColor="text1"/>
         </w:rPr>
         <w:br/>
-        <w:t>│   ├── 05_clustering_proper_kmean</w:t>
-      </w:r>
-      <w:r>
-        <w:rPr>
-          <w:rFonts w:cs="Times New Roman"/>
-          <w:color w:val="000000" w:themeColor="text1"/>
-        </w:rPr>
-        <w:t>s.py  # Spark K-Means</w:t>
+        <w:t>│   ├── 05_clustering_proper_kmeans.py  # Spark K-Means</w:t>
       </w:r>
       <w:r>
         <w:rPr>
@@ -13359,14 +12873,7 @@
           <w:color w:val="000000" w:themeColor="text1"/>
         </w:rPr>
         <w:br/>
-        <w:t>│   ├── models/               # Saved K-Me</w:t>
-      </w:r>
-      <w:r>
-        <w:rPr>
-          <w:rFonts w:cs="Times New Roman"/>
-          <w:color w:val="000000" w:themeColor="text1"/>
-        </w:rPr>
-        <w:t>ans model</w:t>
+        <w:t>│   ├── models/               # Saved K-Means model</w:t>
       </w:r>
       <w:r>
         <w:rPr>

</xml_diff>